<commit_message>
modified homework 06 and 07
</commit_message>
<xml_diff>
--- a/lectures/06_Quadrat_Analysis/assignments/homework_06.docx
+++ b/lectures/06_Quadrat_Analysis/assignments/homework_06.docx
@@ -52,7 +52,30 @@
           <w:rFonts w:ascii="Lato" w:hAnsi="Lato"/>
           <w:color w:val="333333"/>
         </w:rPr>
-        <w:t>(temples.rar)</w:t>
+        <w:t>(</w:t>
+      </w:r>
+      <w:proofErr w:type="spellStart"/>
+      <w:r>
+        <w:rPr>
+          <w:rFonts w:ascii="Lato" w:hAnsi="Lato" w:hint="eastAsia"/>
+          <w:color w:val="333333"/>
+        </w:rPr>
+        <w:t>Ta</w:t>
+      </w:r>
+      <w:r>
+        <w:rPr>
+          <w:rFonts w:ascii="Lato" w:hAnsi="Lato"/>
+          <w:color w:val="333333"/>
+        </w:rPr>
+        <w:t>iwan_temple.shp</w:t>
+      </w:r>
+      <w:proofErr w:type="spellEnd"/>
+      <w:r>
+        <w:rPr>
+          <w:rFonts w:ascii="Lato" w:hAnsi="Lato"/>
+          <w:color w:val="333333"/>
+        </w:rPr>
+        <w:t>)</w:t>
       </w:r>
       <w:r>
         <w:rPr>
@@ -404,6 +427,7 @@
     <w:lsdException w:name="HTML Sample" w:semiHidden="1" w:unhideWhenUsed="1"/>
     <w:lsdException w:name="HTML Typewriter" w:semiHidden="1" w:unhideWhenUsed="1"/>
     <w:lsdException w:name="HTML Variable" w:semiHidden="1" w:unhideWhenUsed="1"/>
+    <w:lsdException w:name="Normal Table" w:semiHidden="1" w:unhideWhenUsed="1"/>
     <w:lsdException w:name="annotation subject" w:semiHidden="1" w:unhideWhenUsed="1"/>
     <w:lsdException w:name="No List" w:semiHidden="1" w:unhideWhenUsed="1"/>
     <w:lsdException w:name="Outline List 1" w:semiHidden="1" w:unhideWhenUsed="1"/>
@@ -450,8 +474,10 @@
     <w:lsdException w:name="Table Subtle 2" w:semiHidden="1" w:unhideWhenUsed="1"/>
     <w:lsdException w:name="Table Web 1" w:semiHidden="1" w:unhideWhenUsed="1"/>
     <w:lsdException w:name="Table Web 2" w:semiHidden="1" w:unhideWhenUsed="1"/>
+    <w:lsdException w:name="Table Web 3" w:semiHidden="1" w:unhideWhenUsed="1"/>
     <w:lsdException w:name="Balloon Text" w:semiHidden="1" w:unhideWhenUsed="1"/>
     <w:lsdException w:name="Table Grid" w:uiPriority="39"/>
+    <w:lsdException w:name="Table Theme" w:semiHidden="1" w:unhideWhenUsed="1"/>
     <w:lsdException w:name="Placeholder Text" w:semiHidden="1"/>
     <w:lsdException w:name="No Spacing" w:uiPriority="1" w:qFormat="1"/>
     <w:lsdException w:name="Light Shading" w:uiPriority="60"/>

</xml_diff>